<commit_message>
TAI manuscript: author biography and photo
Co-Authored-By: Claude Opus 5.5 <noreply@anthropic.com>
Claude-Session: https://claude.ai/code/session_01BZjJPdbxvnVxMrcgFoYMCh
</commit_message>
<xml_diff>
--- a/nmi_screening/TAI_Manuscript_template.docx
+++ b/nmi_screening/TAI_Manuscript_template.docx
@@ -6360,8 +6360,67 @@
     </w:p>
     <w:p>
       <w:pPr/>
-      <w:r>
-        <w:t>Ook Lee is with the Department of Information Systems, Hanyang University, Seoul, Republic of Korea. [Biography to be completed.]</w:t>
+    </w:p>
+    <w:p>
+      <w:pPr>
+        <w:jc w:val="both"/>
+      </w:pPr>
+      <w:r>
+        <w:rPr>
+          <w:sz w:val="16"/>
+        </w:rPr>
+        <w:drawing>
+          <wp:anchor distT="0" distB="0" distL="0" distR="114300" simplePos="0" relativeHeight="2" behindDoc="0" locked="0" layoutInCell="1" allowOverlap="1">
+            <wp:simplePos x="0" y="0"/>
+            <wp:positionH relativeFrom="column">
+              <wp:posOffset>0</wp:posOffset>
+            </wp:positionH>
+            <wp:positionV relativeFrom="paragraph">
+              <wp:posOffset>0</wp:posOffset>
+            </wp:positionV>
+            <wp:extent cx="914400" cy="1143000"/>
+            <wp:effectExtent l="0" t="0" r="0" b="0"/>
+            <wp:wrapSquare wrapText="right"/>
+            <wp:docPr id="3" name="Picture 3"/>
+            <wp:cNvGraphicFramePr/>
+            <a:graphic xmlns:a="http://schemas.openxmlformats.org/drawingml/2006/main" xmlns:pic="http://schemas.openxmlformats.org/drawingml/2006/picture">
+              <a:graphicData uri="http://schemas.openxmlformats.org/drawingml/2006/picture">
+                <pic:pic>
+                  <pic:nvPicPr>
+                    <pic:cNvPr id="0" name="author_photo.jpg"/>
+                    <pic:cNvPicPr/>
+                  </pic:nvPicPr>
+                  <pic:blipFill>
+                    <a:blip r:embed="rId28"/>
+                    <a:stretch>
+                      <a:fillRect/>
+                    </a:stretch>
+                  </pic:blipFill>
+                  <pic:spPr>
+                    <a:xfrm>
+                      <a:off x="0" y="0"/>
+                      <a:ext cx="914400" cy="1143000"/>
+                    </a:xfrm>
+                    <a:prstGeom prst="rect"/>
+                  </pic:spPr>
+                </pic:pic>
+              </a:graphicData>
+            </a:graphic>
+          </wp:anchor>
+        </w:drawing>
+      </w:r>
+      <w:r>
+        <w:rPr>
+          <w:b/>
+          <w:sz w:val="16"/>
+        </w:rPr>
+        <w:t>Ook Lee</w:t>
+      </w:r>
+      <w:r>
+        <w:rPr>
+          <w:sz w:val="16"/>
+        </w:rPr>
+        <w:t xml:space="preserve"> is a professor of department of Information System at Hanyang University, Seoul, Korea. He received a PhD in Management of Information Systems from Claremont Graduate University, USA. He was a faculty member at the University of Queensland, Australia, University of Nevada at Las Vegas, USA and North Carolina A&amp;T State University, USA. His research interests are information system economics, information system maintenance, large language models, and critical social theory.</w:t>
       </w:r>
     </w:p>
     <w:sectPr>

</xml_diff>